<commit_message>
docs: update rapport-test-adria-2027 to PDF format
</commit_message>
<xml_diff>
--- a/docs/rapport-test-adria-2027.docx
+++ b/docs/rapport-test-adria-2027.docx
@@ -740,7 +740,7 @@
               <w:rPr>
                 <w:noProof/>
               </w:rPr>
-              <w:t>5</w:t>
+              <w:t>4</w:t>
             </w:r>
             <w:r>
               <w:rPr>
@@ -801,7 +801,7 @@
               <w:rPr>
                 <w:noProof/>
               </w:rPr>
-              <w:t>6</w:t>
+              <w:t>4</w:t>
             </w:r>
             <w:r>
               <w:rPr>
@@ -862,7 +862,7 @@
               <w:rPr>
                 <w:noProof/>
               </w:rPr>
-              <w:t>6</w:t>
+              <w:t>4</w:t>
             </w:r>
             <w:r>
               <w:rPr>
@@ -923,7 +923,7 @@
               <w:rPr>
                 <w:noProof/>
               </w:rPr>
-              <w:t>6</w:t>
+              <w:t>5</w:t>
             </w:r>
             <w:r>
               <w:rPr>
@@ -984,7 +984,7 @@
               <w:rPr>
                 <w:noProof/>
               </w:rPr>
-              <w:t>7</w:t>
+              <w:t>5</w:t>
             </w:r>
             <w:r>
               <w:rPr>
@@ -1045,7 +1045,7 @@
               <w:rPr>
                 <w:noProof/>
               </w:rPr>
-              <w:t>8</w:t>
+              <w:t>5</w:t>
             </w:r>
             <w:r>
               <w:rPr>
@@ -1106,7 +1106,7 @@
               <w:rPr>
                 <w:noProof/>
               </w:rPr>
-              <w:t>8</w:t>
+              <w:t>5</w:t>
             </w:r>
             <w:r>
               <w:rPr>
@@ -1167,7 +1167,7 @@
               <w:rPr>
                 <w:noProof/>
               </w:rPr>
-              <w:t>8</w:t>
+              <w:t>5</w:t>
             </w:r>
             <w:r>
               <w:rPr>
@@ -1228,7 +1228,7 @@
               <w:rPr>
                 <w:noProof/>
               </w:rPr>
-              <w:t>8</w:t>
+              <w:t>6</w:t>
             </w:r>
             <w:r>
               <w:rPr>
@@ -1289,7 +1289,7 @@
               <w:rPr>
                 <w:noProof/>
               </w:rPr>
-              <w:t>9</w:t>
+              <w:t>6</w:t>
             </w:r>
             <w:r>
               <w:rPr>
@@ -1350,7 +1350,7 @@
               <w:rPr>
                 <w:noProof/>
               </w:rPr>
-              <w:t>9</w:t>
+              <w:t>6</w:t>
             </w:r>
             <w:r>
               <w:rPr>
@@ -1411,7 +1411,7 @@
               <w:rPr>
                 <w:noProof/>
               </w:rPr>
-              <w:t>9</w:t>
+              <w:t>6</w:t>
             </w:r>
             <w:r>
               <w:rPr>
@@ -1472,7 +1472,7 @@
               <w:rPr>
                 <w:noProof/>
               </w:rPr>
-              <w:t>9</w:t>
+              <w:t>6</w:t>
             </w:r>
             <w:r>
               <w:rPr>
@@ -1533,7 +1533,7 @@
               <w:rPr>
                 <w:noProof/>
               </w:rPr>
-              <w:t>10</w:t>
+              <w:t>7</w:t>
             </w:r>
             <w:r>
               <w:rPr>
@@ -1594,7 +1594,7 @@
               <w:rPr>
                 <w:noProof/>
               </w:rPr>
-              <w:t>10</w:t>
+              <w:t>7</w:t>
             </w:r>
             <w:r>
               <w:rPr>
@@ -1655,7 +1655,7 @@
               <w:rPr>
                 <w:noProof/>
               </w:rPr>
-              <w:t>10</w:t>
+              <w:t>7</w:t>
             </w:r>
             <w:r>
               <w:rPr>
@@ -1716,7 +1716,7 @@
               <w:rPr>
                 <w:noProof/>
               </w:rPr>
-              <w:t>10</w:t>
+              <w:t>7</w:t>
             </w:r>
             <w:r>
               <w:rPr>
@@ -1777,7 +1777,7 @@
               <w:rPr>
                 <w:noProof/>
               </w:rPr>
-              <w:t>11</w:t>
+              <w:t>8</w:t>
             </w:r>
             <w:r>
               <w:rPr>
@@ -1838,7 +1838,7 @@
               <w:rPr>
                 <w:noProof/>
               </w:rPr>
-              <w:t>13</w:t>
+              <w:t>10</w:t>
             </w:r>
             <w:r>
               <w:rPr>
@@ -1899,7 +1899,7 @@
               <w:rPr>
                 <w:noProof/>
               </w:rPr>
-              <w:t>13</w:t>
+              <w:t>10</w:t>
             </w:r>
             <w:r>
               <w:rPr>
@@ -1960,7 +1960,7 @@
               <w:rPr>
                 <w:noProof/>
               </w:rPr>
-              <w:t>13</w:t>
+              <w:t>10</w:t>
             </w:r>
             <w:r>
               <w:rPr>
@@ -2021,7 +2021,7 @@
               <w:rPr>
                 <w:noProof/>
               </w:rPr>
-              <w:t>13</w:t>
+              <w:t>10</w:t>
             </w:r>
             <w:r>
               <w:rPr>
@@ -2082,7 +2082,7 @@
               <w:rPr>
                 <w:noProof/>
               </w:rPr>
-              <w:t>14</w:t>
+              <w:t>11</w:t>
             </w:r>
             <w:r>
               <w:rPr>
@@ -2143,7 +2143,7 @@
               <w:rPr>
                 <w:noProof/>
               </w:rPr>
-              <w:t>14</w:t>
+              <w:t>11</w:t>
             </w:r>
             <w:r>
               <w:rPr>
@@ -2204,7 +2204,7 @@
               <w:rPr>
                 <w:noProof/>
               </w:rPr>
-              <w:t>14</w:t>
+              <w:t>11</w:t>
             </w:r>
             <w:r>
               <w:rPr>
@@ -2265,7 +2265,7 @@
               <w:rPr>
                 <w:noProof/>
               </w:rPr>
-              <w:t>14</w:t>
+              <w:t>11</w:t>
             </w:r>
             <w:r>
               <w:rPr>
@@ -2326,7 +2326,7 @@
               <w:rPr>
                 <w:noProof/>
               </w:rPr>
-              <w:t>15</w:t>
+              <w:t>12</w:t>
             </w:r>
             <w:r>
               <w:rPr>

</xml_diff>

<commit_message>
docs: convert rapport-test-adria-2027 from DOCX to PDF format
</commit_message>
<xml_diff>
--- a/docs/rapport-test-adria-2027.docx
+++ b/docs/rapport-test-adria-2027.docx
@@ -4,7 +4,7 @@
   <w:body>
     <w:p>
       <w:pPr>
-        <w:spacing w:before="600"/>
+        <w:spacing w:before="600" w:after="120"/>
         <w:jc w:val="center"/>
       </w:pPr>
       <w:r>
@@ -15,39 +15,56 @@
           <w:sz w:val="24"/>
           <w:szCs w:val="24"/>
         </w:rPr>
-        <w:t>École Normale Supérieure de l'Enseignement Technique (ENSET) — Mohammedia</w:t>
-      </w:r>
-    </w:p>
-    <w:p>
-      <w:pPr>
-        <w:spacing w:before="120"/>
-        <w:jc w:val="center"/>
-      </w:pPr>
-      <w:r>
-        <w:t>Filière : Master Systèmes Distribués et Intelligence Artificielle (SDIA)</w:t>
-      </w:r>
-    </w:p>
-    <w:p>
-      <w:pPr>
-        <w:pBdr>
-          <w:bottom w:val="single" w:sz="8" w:space="8" w:color="C0392B"/>
-        </w:pBdr>
-        <w:spacing w:after="120"/>
-        <w:jc w:val="center"/>
-      </w:pPr>
-      <w:r>
-        <w:rPr>
-          <w:i/>
-          <w:iCs/>
-        </w:rPr>
-        <w:t>Année Universitaire 2026-2027</w:t>
-      </w:r>
-    </w:p>
-    <w:p>
-      <w:pPr>
-        <w:spacing w:before="600" w:after="120"/>
-        <w:jc w:val="center"/>
-      </w:pPr>
+        <w:drawing>
+          <wp:anchor distT="0" distB="0" distL="114300" distR="114300" simplePos="0" relativeHeight="251658240" behindDoc="0" locked="0" layoutInCell="1" allowOverlap="1" wp14:anchorId="659AE0AF" wp14:editId="1ED98CF7">
+            <wp:simplePos x="0" y="0"/>
+            <wp:positionH relativeFrom="margin">
+              <wp:align>center</wp:align>
+            </wp:positionH>
+            <wp:positionV relativeFrom="margin">
+              <wp:align>top</wp:align>
+            </wp:positionV>
+            <wp:extent cx="3251200" cy="1320800"/>
+            <wp:effectExtent l="0" t="0" r="0" b="0"/>
+            <wp:wrapSquare wrapText="bothSides"/>
+            <wp:docPr id="810798841" name="Picture 1"/>
+            <wp:cNvGraphicFramePr>
+              <a:graphicFrameLocks xmlns:a="http://schemas.openxmlformats.org/drawingml/2006/main" noChangeAspect="1"/>
+            </wp:cNvGraphicFramePr>
+            <a:graphic xmlns:a="http://schemas.openxmlformats.org/drawingml/2006/main">
+              <a:graphicData uri="http://schemas.openxmlformats.org/drawingml/2006/picture">
+                <pic:pic xmlns:pic="http://schemas.openxmlformats.org/drawingml/2006/picture">
+                  <pic:nvPicPr>
+                    <pic:cNvPr id="810798841" name=""/>
+                    <pic:cNvPicPr/>
+                  </pic:nvPicPr>
+                  <pic:blipFill>
+                    <a:blip r:embed="rId7">
+                      <a:extLst>
+                        <a:ext uri="{28A0092B-C50C-407E-A947-70E740481C1C}">
+                          <a14:useLocalDpi xmlns:a14="http://schemas.microsoft.com/office/drawing/2010/main" val="0"/>
+                        </a:ext>
+                      </a:extLst>
+                    </a:blip>
+                    <a:stretch>
+                      <a:fillRect/>
+                    </a:stretch>
+                  </pic:blipFill>
+                  <pic:spPr>
+                    <a:xfrm>
+                      <a:off x="0" y="0"/>
+                      <a:ext cx="3251200" cy="1320800"/>
+                    </a:xfrm>
+                    <a:prstGeom prst="rect">
+                      <a:avLst/>
+                    </a:prstGeom>
+                  </pic:spPr>
+                </pic:pic>
+              </a:graphicData>
+            </a:graphic>
+          </wp:anchor>
+        </w:drawing>
+      </w:r>
       <w:r>
         <w:rPr>
           <w:b/>
@@ -116,12 +133,6 @@
         <w:gridCol w:w="6226"/>
       </w:tblGrid>
       <w:tr>
-        <w:tblPrEx>
-          <w:tblCellMar>
-            <w:top w:w="0" w:type="dxa"/>
-            <w:bottom w:w="0" w:type="dxa"/>
-          </w:tblCellMar>
-        </w:tblPrEx>
         <w:tc>
           <w:tcPr>
             <w:tcW w:w="2800" w:type="dxa"/>
@@ -189,12 +200,6 @@
         </w:tc>
       </w:tr>
       <w:tr>
-        <w:tblPrEx>
-          <w:tblCellMar>
-            <w:top w:w="0" w:type="dxa"/>
-            <w:bottom w:w="0" w:type="dxa"/>
-          </w:tblCellMar>
-        </w:tblPrEx>
         <w:tc>
           <w:tcPr>
             <w:tcW w:w="2800" w:type="dxa"/>
@@ -262,12 +267,6 @@
         </w:tc>
       </w:tr>
       <w:tr>
-        <w:tblPrEx>
-          <w:tblCellMar>
-            <w:top w:w="0" w:type="dxa"/>
-            <w:bottom w:w="0" w:type="dxa"/>
-          </w:tblCellMar>
-        </w:tblPrEx>
         <w:tc>
           <w:tcPr>
             <w:tcW w:w="2800" w:type="dxa"/>
@@ -335,12 +334,6 @@
         </w:tc>
       </w:tr>
       <w:tr>
-        <w:tblPrEx>
-          <w:tblCellMar>
-            <w:top w:w="0" w:type="dxa"/>
-            <w:bottom w:w="0" w:type="dxa"/>
-          </w:tblCellMar>
-        </w:tblPrEx>
         <w:tc>
           <w:tcPr>
             <w:tcW w:w="2800" w:type="dxa"/>
@@ -408,12 +401,6 @@
         </w:tc>
       </w:tr>
       <w:tr>
-        <w:tblPrEx>
-          <w:tblCellMar>
-            <w:top w:w="0" w:type="dxa"/>
-            <w:bottom w:w="0" w:type="dxa"/>
-          </w:tblCellMar>
-        </w:tblPrEx>
         <w:tc>
           <w:tcPr>
             <w:tcW w:w="2800" w:type="dxa"/>
@@ -481,12 +468,6 @@
         </w:tc>
       </w:tr>
       <w:tr>
-        <w:tblPrEx>
-          <w:tblCellMar>
-            <w:top w:w="0" w:type="dxa"/>
-            <w:bottom w:w="0" w:type="dxa"/>
-          </w:tblCellMar>
-        </w:tblPrEx>
         <w:tc>
           <w:tcPr>
             <w:tcW w:w="2800" w:type="dxa"/>
@@ -543,7 +524,7 @@
             <w:pPr>
               <w:jc w:val="center"/>
             </w:pPr>
-            <w:hyperlink r:id="rId7" w:history="1">
+            <w:hyperlink r:id="rId8" w:history="1">
               <w:r>
                 <w:rPr>
                   <w:rStyle w:val="Hyperlink"/>
@@ -555,12 +536,6 @@
         </w:tc>
       </w:tr>
       <w:tr>
-        <w:tblPrEx>
-          <w:tblCellMar>
-            <w:top w:w="0" w:type="dxa"/>
-            <w:bottom w:w="0" w:type="dxa"/>
-          </w:tblCellMar>
-        </w:tblPrEx>
         <w:tc>
           <w:tcPr>
             <w:tcW w:w="2800" w:type="dxa"/>
@@ -2390,12 +2365,6 @@
         <w:gridCol w:w="6606"/>
       </w:tblGrid>
       <w:tr>
-        <w:tblPrEx>
-          <w:tblCellMar>
-            <w:top w:w="0" w:type="dxa"/>
-            <w:bottom w:w="0" w:type="dxa"/>
-          </w:tblCellMar>
-        </w:tblPrEx>
         <w:trPr>
           <w:tblHeader/>
         </w:trPr>
@@ -2469,12 +2438,6 @@
         </w:tc>
       </w:tr>
       <w:tr>
-        <w:tblPrEx>
-          <w:tblCellMar>
-            <w:top w:w="0" w:type="dxa"/>
-            <w:bottom w:w="0" w:type="dxa"/>
-          </w:tblCellMar>
-        </w:tblPrEx>
         <w:tc>
           <w:tcPr>
             <w:tcW w:w="2600" w:type="dxa"/>
@@ -2533,12 +2496,6 @@
         </w:tc>
       </w:tr>
       <w:tr>
-        <w:tblPrEx>
-          <w:tblCellMar>
-            <w:top w:w="0" w:type="dxa"/>
-            <w:bottom w:w="0" w:type="dxa"/>
-          </w:tblCellMar>
-        </w:tblPrEx>
         <w:tc>
           <w:tcPr>
             <w:tcW w:w="2600" w:type="dxa"/>
@@ -2597,12 +2554,6 @@
         </w:tc>
       </w:tr>
       <w:tr>
-        <w:tblPrEx>
-          <w:tblCellMar>
-            <w:top w:w="0" w:type="dxa"/>
-            <w:bottom w:w="0" w:type="dxa"/>
-          </w:tblCellMar>
-        </w:tblPrEx>
         <w:tc>
           <w:tcPr>
             <w:tcW w:w="2600" w:type="dxa"/>
@@ -2661,12 +2612,6 @@
         </w:tc>
       </w:tr>
       <w:tr>
-        <w:tblPrEx>
-          <w:tblCellMar>
-            <w:top w:w="0" w:type="dxa"/>
-            <w:bottom w:w="0" w:type="dxa"/>
-          </w:tblCellMar>
-        </w:tblPrEx>
         <w:tc>
           <w:tcPr>
             <w:tcW w:w="2600" w:type="dxa"/>
@@ -2725,12 +2670,6 @@
         </w:tc>
       </w:tr>
       <w:tr>
-        <w:tblPrEx>
-          <w:tblCellMar>
-            <w:top w:w="0" w:type="dxa"/>
-            <w:bottom w:w="0" w:type="dxa"/>
-          </w:tblCellMar>
-        </w:tblPrEx>
         <w:tc>
           <w:tcPr>
             <w:tcW w:w="2600" w:type="dxa"/>
@@ -2789,12 +2728,6 @@
         </w:tc>
       </w:tr>
       <w:tr>
-        <w:tblPrEx>
-          <w:tblCellMar>
-            <w:top w:w="0" w:type="dxa"/>
-            <w:bottom w:w="0" w:type="dxa"/>
-          </w:tblCellMar>
-        </w:tblPrEx>
         <w:tc>
           <w:tcPr>
             <w:tcW w:w="2600" w:type="dxa"/>
@@ -2853,12 +2786,6 @@
         </w:tc>
       </w:tr>
       <w:tr>
-        <w:tblPrEx>
-          <w:tblCellMar>
-            <w:top w:w="0" w:type="dxa"/>
-            <w:bottom w:w="0" w:type="dxa"/>
-          </w:tblCellMar>
-        </w:tblPrEx>
         <w:tc>
           <w:tcPr>
             <w:tcW w:w="2600" w:type="dxa"/>
@@ -2917,12 +2844,6 @@
         </w:tc>
       </w:tr>
       <w:tr>
-        <w:tblPrEx>
-          <w:tblCellMar>
-            <w:top w:w="0" w:type="dxa"/>
-            <w:bottom w:w="0" w:type="dxa"/>
-          </w:tblCellMar>
-        </w:tblPrEx>
         <w:tc>
           <w:tcPr>
             <w:tcW w:w="2600" w:type="dxa"/>
@@ -2981,12 +2902,6 @@
         </w:tc>
       </w:tr>
       <w:tr>
-        <w:tblPrEx>
-          <w:tblCellMar>
-            <w:top w:w="0" w:type="dxa"/>
-            <w:bottom w:w="0" w:type="dxa"/>
-          </w:tblCellMar>
-        </w:tblPrEx>
         <w:tc>
           <w:tcPr>
             <w:tcW w:w="2600" w:type="dxa"/>
@@ -3204,7 +3119,7 @@
                     </pic:cNvPicPr>
                   </pic:nvPicPr>
                   <pic:blipFill>
-                    <a:blip r:embed="rId8"/>
+                    <a:blip r:embed="rId9"/>
                     <a:srcRect/>
                     <a:stretch>
                       <a:fillRect/>
@@ -3265,12 +3180,6 @@
         <w:gridCol w:w="5906"/>
       </w:tblGrid>
       <w:tr>
-        <w:tblPrEx>
-          <w:tblCellMar>
-            <w:top w:w="0" w:type="dxa"/>
-            <w:bottom w:w="0" w:type="dxa"/>
-          </w:tblCellMar>
-        </w:tblPrEx>
         <w:trPr>
           <w:tblHeader/>
         </w:trPr>
@@ -3378,12 +3287,6 @@
         </w:tc>
       </w:tr>
       <w:tr>
-        <w:tblPrEx>
-          <w:tblCellMar>
-            <w:top w:w="0" w:type="dxa"/>
-            <w:bottom w:w="0" w:type="dxa"/>
-          </w:tblCellMar>
-        </w:tblPrEx>
         <w:tc>
           <w:tcPr>
             <w:tcW w:w="2400" w:type="dxa"/>
@@ -3470,12 +3373,6 @@
         </w:tc>
       </w:tr>
       <w:tr>
-        <w:tblPrEx>
-          <w:tblCellMar>
-            <w:top w:w="0" w:type="dxa"/>
-            <w:bottom w:w="0" w:type="dxa"/>
-          </w:tblCellMar>
-        </w:tblPrEx>
         <w:tc>
           <w:tcPr>
             <w:tcW w:w="2400" w:type="dxa"/>
@@ -3562,12 +3459,6 @@
         </w:tc>
       </w:tr>
       <w:tr>
-        <w:tblPrEx>
-          <w:tblCellMar>
-            <w:top w:w="0" w:type="dxa"/>
-            <w:bottom w:w="0" w:type="dxa"/>
-          </w:tblCellMar>
-        </w:tblPrEx>
         <w:tc>
           <w:tcPr>
             <w:tcW w:w="2400" w:type="dxa"/>
@@ -3654,12 +3545,6 @@
         </w:tc>
       </w:tr>
       <w:tr>
-        <w:tblPrEx>
-          <w:tblCellMar>
-            <w:top w:w="0" w:type="dxa"/>
-            <w:bottom w:w="0" w:type="dxa"/>
-          </w:tblCellMar>
-        </w:tblPrEx>
         <w:tc>
           <w:tcPr>
             <w:tcW w:w="2400" w:type="dxa"/>
@@ -3746,12 +3631,6 @@
         </w:tc>
       </w:tr>
       <w:tr>
-        <w:tblPrEx>
-          <w:tblCellMar>
-            <w:top w:w="0" w:type="dxa"/>
-            <w:bottom w:w="0" w:type="dxa"/>
-          </w:tblCellMar>
-        </w:tblPrEx>
         <w:tc>
           <w:tcPr>
             <w:tcW w:w="2400" w:type="dxa"/>
@@ -3838,12 +3717,6 @@
         </w:tc>
       </w:tr>
       <w:tr>
-        <w:tblPrEx>
-          <w:tblCellMar>
-            <w:top w:w="0" w:type="dxa"/>
-            <w:bottom w:w="0" w:type="dxa"/>
-          </w:tblCellMar>
-        </w:tblPrEx>
         <w:tc>
           <w:tcPr>
             <w:tcW w:w="2400" w:type="dxa"/>
@@ -3930,12 +3803,6 @@
         </w:tc>
       </w:tr>
       <w:tr>
-        <w:tblPrEx>
-          <w:tblCellMar>
-            <w:top w:w="0" w:type="dxa"/>
-            <w:bottom w:w="0" w:type="dxa"/>
-          </w:tblCellMar>
-        </w:tblPrEx>
         <w:tc>
           <w:tcPr>
             <w:tcW w:w="2400" w:type="dxa"/>
@@ -4022,12 +3889,6 @@
         </w:tc>
       </w:tr>
       <w:tr>
-        <w:tblPrEx>
-          <w:tblCellMar>
-            <w:top w:w="0" w:type="dxa"/>
-            <w:bottom w:w="0" w:type="dxa"/>
-          </w:tblCellMar>
-        </w:tblPrEx>
         <w:tc>
           <w:tcPr>
             <w:tcW w:w="2400" w:type="dxa"/>
@@ -4114,12 +3975,6 @@
         </w:tc>
       </w:tr>
       <w:tr>
-        <w:tblPrEx>
-          <w:tblCellMar>
-            <w:top w:w="0" w:type="dxa"/>
-            <w:bottom w:w="0" w:type="dxa"/>
-          </w:tblCellMar>
-        </w:tblPrEx>
         <w:tc>
           <w:tcPr>
             <w:tcW w:w="2400" w:type="dxa"/>
@@ -4256,12 +4111,6 @@
         <w:gridCol w:w="6406"/>
       </w:tblGrid>
       <w:tr>
-        <w:tblPrEx>
-          <w:tblCellMar>
-            <w:top w:w="0" w:type="dxa"/>
-            <w:bottom w:w="0" w:type="dxa"/>
-          </w:tblCellMar>
-        </w:tblPrEx>
         <w:trPr>
           <w:tblHeader/>
         </w:trPr>
@@ -4335,12 +4184,6 @@
         </w:tc>
       </w:tr>
       <w:tr>
-        <w:tblPrEx>
-          <w:tblCellMar>
-            <w:top w:w="0" w:type="dxa"/>
-            <w:bottom w:w="0" w:type="dxa"/>
-          </w:tblCellMar>
-        </w:tblPrEx>
         <w:tc>
           <w:tcPr>
             <w:tcW w:w="2800" w:type="dxa"/>
@@ -4399,12 +4242,6 @@
         </w:tc>
       </w:tr>
       <w:tr>
-        <w:tblPrEx>
-          <w:tblCellMar>
-            <w:top w:w="0" w:type="dxa"/>
-            <w:bottom w:w="0" w:type="dxa"/>
-          </w:tblCellMar>
-        </w:tblPrEx>
         <w:tc>
           <w:tcPr>
             <w:tcW w:w="2800" w:type="dxa"/>
@@ -4463,12 +4300,6 @@
         </w:tc>
       </w:tr>
       <w:tr>
-        <w:tblPrEx>
-          <w:tblCellMar>
-            <w:top w:w="0" w:type="dxa"/>
-            <w:bottom w:w="0" w:type="dxa"/>
-          </w:tblCellMar>
-        </w:tblPrEx>
         <w:tc>
           <w:tcPr>
             <w:tcW w:w="2800" w:type="dxa"/>
@@ -4527,12 +4358,6 @@
         </w:tc>
       </w:tr>
       <w:tr>
-        <w:tblPrEx>
-          <w:tblCellMar>
-            <w:top w:w="0" w:type="dxa"/>
-            <w:bottom w:w="0" w:type="dxa"/>
-          </w:tblCellMar>
-        </w:tblPrEx>
         <w:tc>
           <w:tcPr>
             <w:tcW w:w="2800" w:type="dxa"/>
@@ -4591,12 +4416,6 @@
         </w:tc>
       </w:tr>
       <w:tr>
-        <w:tblPrEx>
-          <w:tblCellMar>
-            <w:top w:w="0" w:type="dxa"/>
-            <w:bottom w:w="0" w:type="dxa"/>
-          </w:tblCellMar>
-        </w:tblPrEx>
         <w:tc>
           <w:tcPr>
             <w:tcW w:w="2800" w:type="dxa"/>
@@ -4655,12 +4474,6 @@
         </w:tc>
       </w:tr>
       <w:tr>
-        <w:tblPrEx>
-          <w:tblCellMar>
-            <w:top w:w="0" w:type="dxa"/>
-            <w:bottom w:w="0" w:type="dxa"/>
-          </w:tblCellMar>
-        </w:tblPrEx>
         <w:tc>
           <w:tcPr>
             <w:tcW w:w="2800" w:type="dxa"/>
@@ -4719,12 +4532,6 @@
         </w:tc>
       </w:tr>
       <w:tr>
-        <w:tblPrEx>
-          <w:tblCellMar>
-            <w:top w:w="0" w:type="dxa"/>
-            <w:bottom w:w="0" w:type="dxa"/>
-          </w:tblCellMar>
-        </w:tblPrEx>
         <w:tc>
           <w:tcPr>
             <w:tcW w:w="2800" w:type="dxa"/>
@@ -4783,12 +4590,6 @@
         </w:tc>
       </w:tr>
       <w:tr>
-        <w:tblPrEx>
-          <w:tblCellMar>
-            <w:top w:w="0" w:type="dxa"/>
-            <w:bottom w:w="0" w:type="dxa"/>
-          </w:tblCellMar>
-        </w:tblPrEx>
         <w:tc>
           <w:tcPr>
             <w:tcW w:w="2800" w:type="dxa"/>
@@ -4978,12 +4779,6 @@
         <w:gridCol w:w="6606"/>
       </w:tblGrid>
       <w:tr>
-        <w:tblPrEx>
-          <w:tblCellMar>
-            <w:top w:w="0" w:type="dxa"/>
-            <w:bottom w:w="0" w:type="dxa"/>
-          </w:tblCellMar>
-        </w:tblPrEx>
         <w:trPr>
           <w:tblHeader/>
         </w:trPr>
@@ -5057,12 +4852,6 @@
         </w:tc>
       </w:tr>
       <w:tr>
-        <w:tblPrEx>
-          <w:tblCellMar>
-            <w:top w:w="0" w:type="dxa"/>
-            <w:bottom w:w="0" w:type="dxa"/>
-          </w:tblCellMar>
-        </w:tblPrEx>
         <w:tc>
           <w:tcPr>
             <w:tcW w:w="2600" w:type="dxa"/>
@@ -5121,12 +4910,6 @@
         </w:tc>
       </w:tr>
       <w:tr>
-        <w:tblPrEx>
-          <w:tblCellMar>
-            <w:top w:w="0" w:type="dxa"/>
-            <w:bottom w:w="0" w:type="dxa"/>
-          </w:tblCellMar>
-        </w:tblPrEx>
         <w:tc>
           <w:tcPr>
             <w:tcW w:w="2600" w:type="dxa"/>
@@ -5185,12 +4968,6 @@
         </w:tc>
       </w:tr>
       <w:tr>
-        <w:tblPrEx>
-          <w:tblCellMar>
-            <w:top w:w="0" w:type="dxa"/>
-            <w:bottom w:w="0" w:type="dxa"/>
-          </w:tblCellMar>
-        </w:tblPrEx>
         <w:tc>
           <w:tcPr>
             <w:tcW w:w="2600" w:type="dxa"/>
@@ -5249,12 +5026,6 @@
         </w:tc>
       </w:tr>
       <w:tr>
-        <w:tblPrEx>
-          <w:tblCellMar>
-            <w:top w:w="0" w:type="dxa"/>
-            <w:bottom w:w="0" w:type="dxa"/>
-          </w:tblCellMar>
-        </w:tblPrEx>
         <w:tc>
           <w:tcPr>
             <w:tcW w:w="2600" w:type="dxa"/>
@@ -5313,12 +5084,6 @@
         </w:tc>
       </w:tr>
       <w:tr>
-        <w:tblPrEx>
-          <w:tblCellMar>
-            <w:top w:w="0" w:type="dxa"/>
-            <w:bottom w:w="0" w:type="dxa"/>
-          </w:tblCellMar>
-        </w:tblPrEx>
         <w:tc>
           <w:tcPr>
             <w:tcW w:w="2600" w:type="dxa"/>
@@ -5377,12 +5142,6 @@
         </w:tc>
       </w:tr>
       <w:tr>
-        <w:tblPrEx>
-          <w:tblCellMar>
-            <w:top w:w="0" w:type="dxa"/>
-            <w:bottom w:w="0" w:type="dxa"/>
-          </w:tblCellMar>
-        </w:tblPrEx>
         <w:tc>
           <w:tcPr>
             <w:tcW w:w="2600" w:type="dxa"/>
@@ -5509,12 +5268,6 @@
         <w:gridCol w:w="6206"/>
       </w:tblGrid>
       <w:tr>
-        <w:tblPrEx>
-          <w:tblCellMar>
-            <w:top w:w="0" w:type="dxa"/>
-            <w:bottom w:w="0" w:type="dxa"/>
-          </w:tblCellMar>
-        </w:tblPrEx>
         <w:trPr>
           <w:tblHeader/>
         </w:trPr>
@@ -5588,12 +5341,6 @@
         </w:tc>
       </w:tr>
       <w:tr>
-        <w:tblPrEx>
-          <w:tblCellMar>
-            <w:top w:w="0" w:type="dxa"/>
-            <w:bottom w:w="0" w:type="dxa"/>
-          </w:tblCellMar>
-        </w:tblPrEx>
         <w:tc>
           <w:tcPr>
             <w:tcW w:w="3000" w:type="dxa"/>
@@ -5652,12 +5399,6 @@
         </w:tc>
       </w:tr>
       <w:tr>
-        <w:tblPrEx>
-          <w:tblCellMar>
-            <w:top w:w="0" w:type="dxa"/>
-            <w:bottom w:w="0" w:type="dxa"/>
-          </w:tblCellMar>
-        </w:tblPrEx>
         <w:tc>
           <w:tcPr>
             <w:tcW w:w="3000" w:type="dxa"/>
@@ -5716,12 +5457,6 @@
         </w:tc>
       </w:tr>
       <w:tr>
-        <w:tblPrEx>
-          <w:tblCellMar>
-            <w:top w:w="0" w:type="dxa"/>
-            <w:bottom w:w="0" w:type="dxa"/>
-          </w:tblCellMar>
-        </w:tblPrEx>
         <w:tc>
           <w:tcPr>
             <w:tcW w:w="3000" w:type="dxa"/>
@@ -5780,12 +5515,6 @@
         </w:tc>
       </w:tr>
       <w:tr>
-        <w:tblPrEx>
-          <w:tblCellMar>
-            <w:top w:w="0" w:type="dxa"/>
-            <w:bottom w:w="0" w:type="dxa"/>
-          </w:tblCellMar>
-        </w:tblPrEx>
         <w:tc>
           <w:tcPr>
             <w:tcW w:w="3000" w:type="dxa"/>
@@ -5844,12 +5573,6 @@
         </w:tc>
       </w:tr>
       <w:tr>
-        <w:tblPrEx>
-          <w:tblCellMar>
-            <w:top w:w="0" w:type="dxa"/>
-            <w:bottom w:w="0" w:type="dxa"/>
-          </w:tblCellMar>
-        </w:tblPrEx>
         <w:tc>
           <w:tcPr>
             <w:tcW w:w="3000" w:type="dxa"/>
@@ -6032,400 +5755,6 @@
             <wp:extent cx="5667375" cy="3581400"/>
             <wp:effectExtent l="0" t="0" r="0" b="0"/>
             <wp:docPr id="2" name="Picture 2"/>
-            <wp:cNvGraphicFramePr>
-              <a:graphicFrameLocks xmlns:a="http://schemas.openxmlformats.org/drawingml/2006/main" noChangeAspect="1"/>
-            </wp:cNvGraphicFramePr>
-            <a:graphic xmlns:a="http://schemas.openxmlformats.org/drawingml/2006/main">
-              <a:graphicData uri="http://schemas.openxmlformats.org/drawingml/2006/picture">
-                <pic:pic xmlns:pic="http://schemas.openxmlformats.org/drawingml/2006/picture">
-                  <pic:nvPicPr>
-                    <pic:cNvPr id="0" name=""/>
-                    <pic:cNvPicPr>
-                      <a:picLocks noChangeAspect="1" noChangeArrowheads="1"/>
-                    </pic:cNvPicPr>
-                  </pic:nvPicPr>
-                  <pic:blipFill>
-                    <a:blip r:embed="rId9"/>
-                    <a:srcRect/>
-                    <a:stretch>
-                      <a:fillRect/>
-                    </a:stretch>
-                  </pic:blipFill>
-                  <pic:spPr bwMode="auto">
-                    <a:xfrm>
-                      <a:off x="0" y="0"/>
-                      <a:ext cx="5667375" cy="3581400"/>
-                    </a:xfrm>
-                    <a:prstGeom prst="rect">
-                      <a:avLst/>
-                    </a:prstGeom>
-                  </pic:spPr>
-                </pic:pic>
-              </a:graphicData>
-            </a:graphic>
-          </wp:inline>
-        </w:drawing>
-      </w:r>
-    </w:p>
-    <w:p>
-      <w:pPr>
-        <w:spacing w:before="60" w:after="200"/>
-        <w:jc w:val="center"/>
-      </w:pPr>
-      <w:r>
-        <w:rPr>
-          <w:i/>
-          <w:iCs/>
-          <w:color w:val="7F8C8D"/>
-          <w:sz w:val="18"/>
-          <w:szCs w:val="18"/>
-        </w:rPr>
-        <w:t>Figure 3.1 — Journal d'audit alimenté par Kafka</w:t>
-      </w:r>
-    </w:p>
-    <w:p>
-      <w:pPr>
-        <w:pStyle w:val="Heading1"/>
-      </w:pPr>
-      <w:bookmarkStart w:id="13" w:name="_Toc244252214"/>
-      <w:r>
-        <w:t xml:space="preserve">Étape 4 : Chatbot </w:t>
-      </w:r>
-      <w:r>
-        <w:t>agentique</w:t>
-      </w:r>
-      <w:bookmarkEnd w:id="13"/>
-    </w:p>
-    <w:p>
-      <w:pPr>
-        <w:pStyle w:val="Heading2"/>
-        <w:spacing w:before="200" w:after="100"/>
-      </w:pPr>
-      <w:bookmarkStart w:id="14" w:name="_Toc244252215"/>
-      <w:r>
-        <w:t>4.1 Principe</w:t>
-      </w:r>
-      <w:bookmarkEnd w:id="14"/>
-    </w:p>
-    <w:p>
-      <w:pPr>
-        <w:spacing w:before="80" w:after="80" w:line="320" w:lineRule="auto"/>
-        <w:jc w:val="both"/>
-      </w:pPr>
-      <w:r>
-        <w:t>L'agent n'utilise aucun modèle entraîné localement : il appelle un LLM distant (Groq, API compatible OpenAI) avec une simple clé d'API lue depuis .env (non versionné). Spring AI ChatClient lui fournit les tools du client MCP (transport SSE) connecté à account-service et transaction-service : 12 tools MCP sont chargés au démarrage. Le prompt système lui interdit d'inventer un solde ou une transaction.</w:t>
-      </w:r>
-    </w:p>
-    <w:p>
-      <w:pPr>
-        <w:pStyle w:val="Heading2"/>
-        <w:spacing w:before="200" w:after="100"/>
-      </w:pPr>
-      <w:bookmarkStart w:id="15" w:name="_Toc244252216"/>
-      <w:r>
-        <w:t>4.2 Problèmes résolus</w:t>
-      </w:r>
-      <w:bookmarkEnd w:id="15"/>
-    </w:p>
-    <w:p>
-      <w:pPr>
-        <w:pStyle w:val="ListParagraph"/>
-        <w:numPr>
-          <w:ilvl w:val="0"/>
-          <w:numId w:val="3"/>
-        </w:numPr>
-        <w:spacing w:before="40" w:after="40" w:line="300" w:lineRule="auto"/>
-        <w:jc w:val="both"/>
-      </w:pPr>
-      <w:r>
-        <w:t>Spring AI 2 utilise le SDK officiel OpenAI : l'URL de base doit se terminer par /v1 (sinon 404 sur /openai/chat/completions).</w:t>
-      </w:r>
-    </w:p>
-    <w:p>
-      <w:pPr>
-        <w:pStyle w:val="ListParagraph"/>
-        <w:numPr>
-          <w:ilvl w:val="0"/>
-          <w:numId w:val="3"/>
-        </w:numPr>
-        <w:spacing w:before="40" w:after="40" w:line="300" w:lineRule="auto"/>
-        <w:jc w:val="both"/>
-      </w:pPr>
-      <w:r>
-        <w:t>openai/gpt-oss-120b a été rejeté par Groq lors du tour suivant l'appel de tool (propriété reasoning_content non supportée) ; le modèle retenu est qwen/qwen3.8-27b.</w:t>
-      </w:r>
-    </w:p>
-    <w:p>
-      <w:pPr>
-        <w:pStyle w:val="Heading2"/>
-        <w:spacing w:before="200" w:after="100"/>
-      </w:pPr>
-      <w:bookmarkStart w:id="16" w:name="_Toc244252217"/>
-      <w:r>
-        <w:t>4.3 Tests réels</w:t>
-      </w:r>
-      <w:bookmarkEnd w:id="16"/>
-    </w:p>
-    <w:tbl>
-      <w:tblPr>
-        <w:tblW w:w="9206" w:type="dxa"/>
-        <w:tblBorders>
-          <w:top w:val="single" w:sz="4" w:space="0" w:color="auto"/>
-          <w:left w:val="single" w:sz="4" w:space="0" w:color="auto"/>
-          <w:bottom w:val="single" w:sz="4" w:space="0" w:color="auto"/>
-          <w:right w:val="single" w:sz="4" w:space="0" w:color="auto"/>
-          <w:insideH w:val="single" w:sz="4" w:space="0" w:color="auto"/>
-          <w:insideV w:val="single" w:sz="4" w:space="0" w:color="auto"/>
-        </w:tblBorders>
-        <w:tblCellMar>
-          <w:left w:w="10" w:type="dxa"/>
-          <w:right w:w="10" w:type="dxa"/>
-        </w:tblCellMar>
-        <w:tblLook w:val="0000" w:firstRow="0" w:lastRow="0" w:firstColumn="0" w:lastColumn="0" w:noHBand="0" w:noVBand="0"/>
-      </w:tblPr>
-      <w:tblGrid>
-        <w:gridCol w:w="3800"/>
-        <w:gridCol w:w="5406"/>
-      </w:tblGrid>
-      <w:tr>
-        <w:tblPrEx>
-          <w:tblCellMar>
-            <w:top w:w="0" w:type="dxa"/>
-            <w:bottom w:w="0" w:type="dxa"/>
-          </w:tblCellMar>
-        </w:tblPrEx>
-        <w:trPr>
-          <w:tblHeader/>
-        </w:trPr>
-        <w:tc>
-          <w:tcPr>
-            <w:tcW w:w="3800" w:type="dxa"/>
-            <w:tcBorders>
-              <w:top w:val="single" w:sz="4" w:space="0" w:color="BDC3C7"/>
-              <w:left w:val="single" w:sz="4" w:space="0" w:color="BDC3C7"/>
-              <w:bottom w:val="single" w:sz="4" w:space="0" w:color="BDC3C7"/>
-              <w:right w:val="single" w:sz="4" w:space="0" w:color="BDC3C7"/>
-            </w:tcBorders>
-            <w:shd w:val="clear" w:color="auto" w:fill="2C3E50"/>
-            <w:tcMar>
-              <w:top w:w="100" w:type="dxa"/>
-              <w:left w:w="140" w:type="dxa"/>
-              <w:bottom w:w="100" w:type="dxa"/>
-              <w:right w:w="140" w:type="dxa"/>
-            </w:tcMar>
-            <w:vAlign w:val="center"/>
-          </w:tcPr>
-          <w:p>
-            <w:pPr>
-              <w:jc w:val="center"/>
-            </w:pPr>
-            <w:r>
-              <w:rPr>
-                <w:b/>
-                <w:bCs/>
-                <w:color w:val="FFFFFF"/>
-                <w:sz w:val="20"/>
-                <w:szCs w:val="20"/>
-              </w:rPr>
-              <w:t>Question</w:t>
-            </w:r>
-          </w:p>
-        </w:tc>
-        <w:tc>
-          <w:tcPr>
-            <w:tcW w:w="5406" w:type="dxa"/>
-            <w:tcBorders>
-              <w:top w:val="single" w:sz="4" w:space="0" w:color="BDC3C7"/>
-              <w:left w:val="single" w:sz="4" w:space="0" w:color="BDC3C7"/>
-              <w:bottom w:val="single" w:sz="4" w:space="0" w:color="BDC3C7"/>
-              <w:right w:val="single" w:sz="4" w:space="0" w:color="BDC3C7"/>
-            </w:tcBorders>
-            <w:shd w:val="clear" w:color="auto" w:fill="2C3E50"/>
-            <w:tcMar>
-              <w:top w:w="100" w:type="dxa"/>
-              <w:left w:w="140" w:type="dxa"/>
-              <w:bottom w:w="100" w:type="dxa"/>
-              <w:right w:w="140" w:type="dxa"/>
-            </w:tcMar>
-            <w:vAlign w:val="center"/>
-          </w:tcPr>
-          <w:p>
-            <w:pPr>
-              <w:jc w:val="center"/>
-            </w:pPr>
-            <w:r>
-              <w:rPr>
-                <w:b/>
-                <w:bCs/>
-                <w:color w:val="FFFFFF"/>
-                <w:sz w:val="20"/>
-                <w:szCs w:val="20"/>
-              </w:rPr>
-              <w:t>Réponse de l'agent</w:t>
-            </w:r>
-          </w:p>
-        </w:tc>
-      </w:tr>
-      <w:tr>
-        <w:tblPrEx>
-          <w:tblCellMar>
-            <w:top w:w="0" w:type="dxa"/>
-            <w:bottom w:w="0" w:type="dxa"/>
-          </w:tblCellMar>
-        </w:tblPrEx>
-        <w:tc>
-          <w:tcPr>
-            <w:tcW w:w="3800" w:type="dxa"/>
-            <w:tcBorders>
-              <w:top w:val="single" w:sz="4" w:space="0" w:color="BDC3C7"/>
-              <w:left w:val="single" w:sz="4" w:space="0" w:color="BDC3C7"/>
-              <w:bottom w:val="single" w:sz="4" w:space="0" w:color="BDC3C7"/>
-              <w:right w:val="single" w:sz="4" w:space="0" w:color="BDC3C7"/>
-            </w:tcBorders>
-            <w:shd w:val="clear" w:color="auto" w:fill="FFFFFF"/>
-            <w:tcMar>
-              <w:top w:w="100" w:type="dxa"/>
-              <w:left w:w="140" w:type="dxa"/>
-              <w:bottom w:w="100" w:type="dxa"/>
-              <w:right w:w="140" w:type="dxa"/>
-            </w:tcMar>
-            <w:vAlign w:val="center"/>
-          </w:tcPr>
-          <w:p>
-            <w:r>
-              <w:rPr>
-                <w:sz w:val="20"/>
-                <w:szCs w:val="20"/>
-              </w:rPr>
-              <w:t>Quel est le solde de CUST-001 ?</w:t>
-            </w:r>
-          </w:p>
-        </w:tc>
-        <w:tc>
-          <w:tcPr>
-            <w:tcW w:w="5406" w:type="dxa"/>
-            <w:tcBorders>
-              <w:top w:val="single" w:sz="4" w:space="0" w:color="BDC3C7"/>
-              <w:left w:val="single" w:sz="4" w:space="0" w:color="BDC3C7"/>
-              <w:bottom w:val="single" w:sz="4" w:space="0" w:color="BDC3C7"/>
-              <w:right w:val="single" w:sz="4" w:space="0" w:color="BDC3C7"/>
-            </w:tcBorders>
-            <w:shd w:val="clear" w:color="auto" w:fill="FFFFFF"/>
-            <w:tcMar>
-              <w:top w:w="100" w:type="dxa"/>
-              <w:left w:w="140" w:type="dxa"/>
-              <w:bottom w:w="100" w:type="dxa"/>
-              <w:right w:w="140" w:type="dxa"/>
-            </w:tcMar>
-            <w:vAlign w:val="center"/>
-          </w:tcPr>
-          <w:p>
-            <w:r>
-              <w:rPr>
-                <w:sz w:val="20"/>
-                <w:szCs w:val="20"/>
-              </w:rPr>
-              <w:t>Le solde du compte CUST-001 est de 4 750,00 EUR (statut : actif).</w:t>
-            </w:r>
-          </w:p>
-        </w:tc>
-      </w:tr>
-      <w:tr>
-        <w:tblPrEx>
-          <w:tblCellMar>
-            <w:top w:w="0" w:type="dxa"/>
-            <w:bottom w:w="0" w:type="dxa"/>
-          </w:tblCellMar>
-        </w:tblPrEx>
-        <w:tc>
-          <w:tcPr>
-            <w:tcW w:w="3800" w:type="dxa"/>
-            <w:tcBorders>
-              <w:top w:val="single" w:sz="4" w:space="0" w:color="BDC3C7"/>
-              <w:left w:val="single" w:sz="4" w:space="0" w:color="BDC3C7"/>
-              <w:bottom w:val="single" w:sz="4" w:space="0" w:color="BDC3C7"/>
-              <w:right w:val="single" w:sz="4" w:space="0" w:color="BDC3C7"/>
-            </w:tcBorders>
-            <w:shd w:val="clear" w:color="auto" w:fill="EBF5FB"/>
-            <w:tcMar>
-              <w:top w:w="100" w:type="dxa"/>
-              <w:left w:w="140" w:type="dxa"/>
-              <w:bottom w:w="100" w:type="dxa"/>
-              <w:right w:w="140" w:type="dxa"/>
-            </w:tcMar>
-            <w:vAlign w:val="center"/>
-          </w:tcPr>
-          <w:p>
-            <w:r>
-              <w:rPr>
-                <w:sz w:val="20"/>
-                <w:szCs w:val="20"/>
-              </w:rPr>
-              <w:lastRenderedPageBreak/>
-              <w:t>Fais un virement de 100 EUR de CUST-001 vers CUST-002, puis donne les deux soldes.</w:t>
-            </w:r>
-          </w:p>
-        </w:tc>
-        <w:tc>
-          <w:tcPr>
-            <w:tcW w:w="5406" w:type="dxa"/>
-            <w:tcBorders>
-              <w:top w:val="single" w:sz="4" w:space="0" w:color="BDC3C7"/>
-              <w:left w:val="single" w:sz="4" w:space="0" w:color="BDC3C7"/>
-              <w:bottom w:val="single" w:sz="4" w:space="0" w:color="BDC3C7"/>
-              <w:right w:val="single" w:sz="4" w:space="0" w:color="BDC3C7"/>
-            </w:tcBorders>
-            <w:shd w:val="clear" w:color="auto" w:fill="EBF5FB"/>
-            <w:tcMar>
-              <w:top w:w="100" w:type="dxa"/>
-              <w:left w:w="140" w:type="dxa"/>
-              <w:bottom w:w="100" w:type="dxa"/>
-              <w:right w:w="140" w:type="dxa"/>
-            </w:tcMar>
-            <w:vAlign w:val="center"/>
-          </w:tcPr>
-          <w:p>
-            <w:r>
-              <w:rPr>
-                <w:sz w:val="20"/>
-                <w:szCs w:val="20"/>
-              </w:rPr>
-              <w:t>Virement effectué ; CUST-001 : 4 650,00 EUR, CUST-002 : 1 300,00 EUR.</w:t>
-            </w:r>
-          </w:p>
-        </w:tc>
-      </w:tr>
-    </w:tbl>
-    <w:p>
-      <w:pPr>
-        <w:spacing w:before="60" w:after="200"/>
-        <w:jc w:val="center"/>
-      </w:pPr>
-      <w:r>
-        <w:rPr>
-          <w:i/>
-          <w:iCs/>
-          <w:color w:val="7F8C8D"/>
-          <w:sz w:val="18"/>
-          <w:szCs w:val="18"/>
-        </w:rPr>
-        <w:t>Tableau 4.1 — Échanges réels avec l'agent (endpoint POST /api/chat)</w:t>
-      </w:r>
-    </w:p>
-    <w:p>
-      <w:pPr>
-        <w:spacing w:before="120" w:after="40"/>
-        <w:jc w:val="center"/>
-      </w:pPr>
-      <w:r>
-        <w:rPr>
-          <w:noProof/>
-        </w:rPr>
-        <w:drawing>
-          <wp:inline distT="0" distB="0" distL="0" distR="0" wp14:anchorId="13BD8E30" wp14:editId="6A047AE9">
-            <wp:extent cx="5667375" cy="3581400"/>
-            <wp:effectExtent l="0" t="0" r="0" b="0"/>
-            <wp:docPr id="3" name="Picture 3"/>
             <wp:cNvGraphicFramePr>
               <a:graphicFrameLocks xmlns:a="http://schemas.openxmlformats.org/drawingml/2006/main" noChangeAspect="1"/>
             </wp:cNvGraphicFramePr>
@@ -6474,21 +5803,32 @@
           <w:sz w:val="18"/>
           <w:szCs w:val="18"/>
         </w:rPr>
-        <w:t>Figure 4.1 — Assistant IA dans le client Angular</w:t>
+        <w:t>Figure 3.1 — Journal d'audit alimenté par Kafka</w:t>
       </w:r>
     </w:p>
     <w:p>
       <w:pPr>
         <w:pStyle w:val="Heading1"/>
       </w:pPr>
-      <w:bookmarkStart w:id="17" w:name="_Toc244252218"/>
-      <w:r>
-        <w:t xml:space="preserve">Étape 5 : Client </w:t>
-      </w:r>
-      <w:r>
-        <w:t>Angular</w:t>
-      </w:r>
-      <w:bookmarkEnd w:id="17"/>
+      <w:bookmarkStart w:id="13" w:name="_Toc244252214"/>
+      <w:r>
+        <w:t xml:space="preserve">Étape 4 : Chatbot </w:t>
+      </w:r>
+      <w:r>
+        <w:t>agentique</w:t>
+      </w:r>
+      <w:bookmarkEnd w:id="13"/>
+    </w:p>
+    <w:p>
+      <w:pPr>
+        <w:pStyle w:val="Heading2"/>
+        <w:spacing w:before="200" w:after="100"/>
+      </w:pPr>
+      <w:bookmarkStart w:id="14" w:name="_Toc244252215"/>
+      <w:r>
+        <w:t>4.1 Principe</w:t>
+      </w:r>
+      <w:bookmarkEnd w:id="14"/>
     </w:p>
     <w:p>
       <w:pPr>
@@ -6496,7 +5836,285 @@
         <w:jc w:val="both"/>
       </w:pPr>
       <w:r>
-        <w:t>Le client Angular 22 (thème blanc et bleu ciel) propose cinq onglets : Comptes (liste, création, blocage/activation), Opérations (paiement, dépôt, virement), Historique (filtrable par compte), Audit (événements Kafka) et Assistant. En développement, un proxy redirige /api/accounts et /api/transactions vers la passerelle, /api/audits vers audit-service et /api/chat vers le chatbot.</w:t>
+        <w:t>L'agent n'utilise aucun modèle entraîné localement : il appelle un LLM distant (Groq, API compatible OpenAI) avec une simple clé d'API lue depuis .env (non versionné). Spring AI ChatClient lui fournit les tools du client MCP (transport SSE) connecté à account-service et transaction-service : 12 tools MCP sont chargés au démarrage. Le prompt système lui interdit d'inventer un solde ou une transaction.</w:t>
+      </w:r>
+    </w:p>
+    <w:p>
+      <w:pPr>
+        <w:pStyle w:val="Heading2"/>
+        <w:spacing w:before="200" w:after="100"/>
+      </w:pPr>
+      <w:bookmarkStart w:id="15" w:name="_Toc244252216"/>
+      <w:r>
+        <w:t>4.2 Problèmes résolus</w:t>
+      </w:r>
+      <w:bookmarkEnd w:id="15"/>
+    </w:p>
+    <w:p>
+      <w:pPr>
+        <w:pStyle w:val="ListParagraph"/>
+        <w:numPr>
+          <w:ilvl w:val="0"/>
+          <w:numId w:val="3"/>
+        </w:numPr>
+        <w:spacing w:before="40" w:after="40" w:line="300" w:lineRule="auto"/>
+        <w:jc w:val="both"/>
+      </w:pPr>
+      <w:r>
+        <w:t>Spring AI 2 utilise le SDK officiel OpenAI : l'URL de base doit se terminer par /v1 (sinon 404 sur /openai/chat/completions).</w:t>
+      </w:r>
+    </w:p>
+    <w:p>
+      <w:pPr>
+        <w:pStyle w:val="ListParagraph"/>
+        <w:numPr>
+          <w:ilvl w:val="0"/>
+          <w:numId w:val="3"/>
+        </w:numPr>
+        <w:spacing w:before="40" w:after="40" w:line="300" w:lineRule="auto"/>
+        <w:jc w:val="both"/>
+      </w:pPr>
+      <w:r>
+        <w:t>openai/gpt-oss-120b a été rejeté par Groq lors du tour suivant l'appel de tool (propriété reasoning_content non supportée) ; le modèle retenu est qwen/qwen3.8-27b.</w:t>
+      </w:r>
+    </w:p>
+    <w:p>
+      <w:pPr>
+        <w:pStyle w:val="Heading2"/>
+        <w:spacing w:before="200" w:after="100"/>
+      </w:pPr>
+      <w:bookmarkStart w:id="16" w:name="_Toc244252217"/>
+      <w:r>
+        <w:t>4.3 Tests réels</w:t>
+      </w:r>
+      <w:bookmarkEnd w:id="16"/>
+    </w:p>
+    <w:tbl>
+      <w:tblPr>
+        <w:tblW w:w="9206" w:type="dxa"/>
+        <w:tblBorders>
+          <w:top w:val="single" w:sz="4" w:space="0" w:color="auto"/>
+          <w:left w:val="single" w:sz="4" w:space="0" w:color="auto"/>
+          <w:bottom w:val="single" w:sz="4" w:space="0" w:color="auto"/>
+          <w:right w:val="single" w:sz="4" w:space="0" w:color="auto"/>
+          <w:insideH w:val="single" w:sz="4" w:space="0" w:color="auto"/>
+          <w:insideV w:val="single" w:sz="4" w:space="0" w:color="auto"/>
+        </w:tblBorders>
+        <w:tblCellMar>
+          <w:left w:w="10" w:type="dxa"/>
+          <w:right w:w="10" w:type="dxa"/>
+        </w:tblCellMar>
+        <w:tblLook w:val="0000" w:firstRow="0" w:lastRow="0" w:firstColumn="0" w:lastColumn="0" w:noHBand="0" w:noVBand="0"/>
+      </w:tblPr>
+      <w:tblGrid>
+        <w:gridCol w:w="3800"/>
+        <w:gridCol w:w="5406"/>
+      </w:tblGrid>
+      <w:tr>
+        <w:trPr>
+          <w:tblHeader/>
+        </w:trPr>
+        <w:tc>
+          <w:tcPr>
+            <w:tcW w:w="3800" w:type="dxa"/>
+            <w:tcBorders>
+              <w:top w:val="single" w:sz="4" w:space="0" w:color="BDC3C7"/>
+              <w:left w:val="single" w:sz="4" w:space="0" w:color="BDC3C7"/>
+              <w:bottom w:val="single" w:sz="4" w:space="0" w:color="BDC3C7"/>
+              <w:right w:val="single" w:sz="4" w:space="0" w:color="BDC3C7"/>
+            </w:tcBorders>
+            <w:shd w:val="clear" w:color="auto" w:fill="2C3E50"/>
+            <w:tcMar>
+              <w:top w:w="100" w:type="dxa"/>
+              <w:left w:w="140" w:type="dxa"/>
+              <w:bottom w:w="100" w:type="dxa"/>
+              <w:right w:w="140" w:type="dxa"/>
+            </w:tcMar>
+            <w:vAlign w:val="center"/>
+          </w:tcPr>
+          <w:p>
+            <w:pPr>
+              <w:jc w:val="center"/>
+            </w:pPr>
+            <w:r>
+              <w:rPr>
+                <w:b/>
+                <w:bCs/>
+                <w:color w:val="FFFFFF"/>
+                <w:sz w:val="20"/>
+                <w:szCs w:val="20"/>
+              </w:rPr>
+              <w:t>Question</w:t>
+            </w:r>
+          </w:p>
+        </w:tc>
+        <w:tc>
+          <w:tcPr>
+            <w:tcW w:w="5406" w:type="dxa"/>
+            <w:tcBorders>
+              <w:top w:val="single" w:sz="4" w:space="0" w:color="BDC3C7"/>
+              <w:left w:val="single" w:sz="4" w:space="0" w:color="BDC3C7"/>
+              <w:bottom w:val="single" w:sz="4" w:space="0" w:color="BDC3C7"/>
+              <w:right w:val="single" w:sz="4" w:space="0" w:color="BDC3C7"/>
+            </w:tcBorders>
+            <w:shd w:val="clear" w:color="auto" w:fill="2C3E50"/>
+            <w:tcMar>
+              <w:top w:w="100" w:type="dxa"/>
+              <w:left w:w="140" w:type="dxa"/>
+              <w:bottom w:w="100" w:type="dxa"/>
+              <w:right w:w="140" w:type="dxa"/>
+            </w:tcMar>
+            <w:vAlign w:val="center"/>
+          </w:tcPr>
+          <w:p>
+            <w:pPr>
+              <w:jc w:val="center"/>
+            </w:pPr>
+            <w:r>
+              <w:rPr>
+                <w:b/>
+                <w:bCs/>
+                <w:color w:val="FFFFFF"/>
+                <w:sz w:val="20"/>
+                <w:szCs w:val="20"/>
+              </w:rPr>
+              <w:t>Réponse de l'agent</w:t>
+            </w:r>
+          </w:p>
+        </w:tc>
+      </w:tr>
+      <w:tr>
+        <w:tc>
+          <w:tcPr>
+            <w:tcW w:w="3800" w:type="dxa"/>
+            <w:tcBorders>
+              <w:top w:val="single" w:sz="4" w:space="0" w:color="BDC3C7"/>
+              <w:left w:val="single" w:sz="4" w:space="0" w:color="BDC3C7"/>
+              <w:bottom w:val="single" w:sz="4" w:space="0" w:color="BDC3C7"/>
+              <w:right w:val="single" w:sz="4" w:space="0" w:color="BDC3C7"/>
+            </w:tcBorders>
+            <w:shd w:val="clear" w:color="auto" w:fill="FFFFFF"/>
+            <w:tcMar>
+              <w:top w:w="100" w:type="dxa"/>
+              <w:left w:w="140" w:type="dxa"/>
+              <w:bottom w:w="100" w:type="dxa"/>
+              <w:right w:w="140" w:type="dxa"/>
+            </w:tcMar>
+            <w:vAlign w:val="center"/>
+          </w:tcPr>
+          <w:p>
+            <w:r>
+              <w:rPr>
+                <w:sz w:val="20"/>
+                <w:szCs w:val="20"/>
+              </w:rPr>
+              <w:t>Quel est le solde de CUST-001 ?</w:t>
+            </w:r>
+          </w:p>
+        </w:tc>
+        <w:tc>
+          <w:tcPr>
+            <w:tcW w:w="5406" w:type="dxa"/>
+            <w:tcBorders>
+              <w:top w:val="single" w:sz="4" w:space="0" w:color="BDC3C7"/>
+              <w:left w:val="single" w:sz="4" w:space="0" w:color="BDC3C7"/>
+              <w:bottom w:val="single" w:sz="4" w:space="0" w:color="BDC3C7"/>
+              <w:right w:val="single" w:sz="4" w:space="0" w:color="BDC3C7"/>
+            </w:tcBorders>
+            <w:shd w:val="clear" w:color="auto" w:fill="FFFFFF"/>
+            <w:tcMar>
+              <w:top w:w="100" w:type="dxa"/>
+              <w:left w:w="140" w:type="dxa"/>
+              <w:bottom w:w="100" w:type="dxa"/>
+              <w:right w:w="140" w:type="dxa"/>
+            </w:tcMar>
+            <w:vAlign w:val="center"/>
+          </w:tcPr>
+          <w:p>
+            <w:r>
+              <w:rPr>
+                <w:sz w:val="20"/>
+                <w:szCs w:val="20"/>
+              </w:rPr>
+              <w:t>Le solde du compte CUST-001 est de 4 750,00 EUR (statut : actif).</w:t>
+            </w:r>
+          </w:p>
+        </w:tc>
+      </w:tr>
+      <w:tr>
+        <w:tc>
+          <w:tcPr>
+            <w:tcW w:w="3800" w:type="dxa"/>
+            <w:tcBorders>
+              <w:top w:val="single" w:sz="4" w:space="0" w:color="BDC3C7"/>
+              <w:left w:val="single" w:sz="4" w:space="0" w:color="BDC3C7"/>
+              <w:bottom w:val="single" w:sz="4" w:space="0" w:color="BDC3C7"/>
+              <w:right w:val="single" w:sz="4" w:space="0" w:color="BDC3C7"/>
+            </w:tcBorders>
+            <w:shd w:val="clear" w:color="auto" w:fill="EBF5FB"/>
+            <w:tcMar>
+              <w:top w:w="100" w:type="dxa"/>
+              <w:left w:w="140" w:type="dxa"/>
+              <w:bottom w:w="100" w:type="dxa"/>
+              <w:right w:w="140" w:type="dxa"/>
+            </w:tcMar>
+            <w:vAlign w:val="center"/>
+          </w:tcPr>
+          <w:p>
+            <w:r>
+              <w:rPr>
+                <w:sz w:val="20"/>
+                <w:szCs w:val="20"/>
+              </w:rPr>
+              <w:lastRenderedPageBreak/>
+              <w:t>Fais un virement de 100 EUR de CUST-001 vers CUST-002, puis donne les deux soldes.</w:t>
+            </w:r>
+          </w:p>
+        </w:tc>
+        <w:tc>
+          <w:tcPr>
+            <w:tcW w:w="5406" w:type="dxa"/>
+            <w:tcBorders>
+              <w:top w:val="single" w:sz="4" w:space="0" w:color="BDC3C7"/>
+              <w:left w:val="single" w:sz="4" w:space="0" w:color="BDC3C7"/>
+              <w:bottom w:val="single" w:sz="4" w:space="0" w:color="BDC3C7"/>
+              <w:right w:val="single" w:sz="4" w:space="0" w:color="BDC3C7"/>
+            </w:tcBorders>
+            <w:shd w:val="clear" w:color="auto" w:fill="EBF5FB"/>
+            <w:tcMar>
+              <w:top w:w="100" w:type="dxa"/>
+              <w:left w:w="140" w:type="dxa"/>
+              <w:bottom w:w="100" w:type="dxa"/>
+              <w:right w:w="140" w:type="dxa"/>
+            </w:tcMar>
+            <w:vAlign w:val="center"/>
+          </w:tcPr>
+          <w:p>
+            <w:r>
+              <w:rPr>
+                <w:sz w:val="20"/>
+                <w:szCs w:val="20"/>
+              </w:rPr>
+              <w:t>Virement effectué ; CUST-001 : 4 650,00 EUR, CUST-002 : 1 300,00 EUR.</w:t>
+            </w:r>
+          </w:p>
+        </w:tc>
+      </w:tr>
+    </w:tbl>
+    <w:p>
+      <w:pPr>
+        <w:spacing w:before="60" w:after="200"/>
+        <w:jc w:val="center"/>
+      </w:pPr>
+      <w:r>
+        <w:rPr>
+          <w:i/>
+          <w:iCs/>
+          <w:color w:val="7F8C8D"/>
+          <w:sz w:val="18"/>
+          <w:szCs w:val="18"/>
+        </w:rPr>
+        <w:t>Tableau 4.1 — Échanges réels avec l'agent (endpoint POST /api/chat)</w:t>
       </w:r>
     </w:p>
     <w:p>
@@ -6508,12 +6126,11 @@
         <w:rPr>
           <w:noProof/>
         </w:rPr>
-        <w:lastRenderedPageBreak/>
         <w:drawing>
-          <wp:inline distT="0" distB="0" distL="0" distR="0" wp14:anchorId="48EC34AE" wp14:editId="28ADD09A">
+          <wp:inline distT="0" distB="0" distL="0" distR="0" wp14:anchorId="13BD8E30" wp14:editId="6A047AE9">
             <wp:extent cx="5667375" cy="3581400"/>
             <wp:effectExtent l="0" t="0" r="0" b="0"/>
-            <wp:docPr id="4" name="Picture 4"/>
+            <wp:docPr id="3" name="Picture 3"/>
             <wp:cNvGraphicFramePr>
               <a:graphicFrameLocks xmlns:a="http://schemas.openxmlformats.org/drawingml/2006/main" noChangeAspect="1"/>
             </wp:cNvGraphicFramePr>
@@ -6562,7 +6179,29 @@
           <w:sz w:val="18"/>
           <w:szCs w:val="18"/>
         </w:rPr>
-        <w:t>Figure 5.1 — Tableau de bord des comptes</w:t>
+        <w:t>Figure 4.1 — Assistant IA dans le client Angular</w:t>
+      </w:r>
+    </w:p>
+    <w:p>
+      <w:pPr>
+        <w:pStyle w:val="Heading1"/>
+      </w:pPr>
+      <w:bookmarkStart w:id="17" w:name="_Toc244252218"/>
+      <w:r>
+        <w:t xml:space="preserve">Étape 5 : Client </w:t>
+      </w:r>
+      <w:r>
+        <w:t>Angular</w:t>
+      </w:r>
+      <w:bookmarkEnd w:id="17"/>
+    </w:p>
+    <w:p>
+      <w:pPr>
+        <w:spacing w:before="80" w:after="80" w:line="320" w:lineRule="auto"/>
+        <w:jc w:val="both"/>
+      </w:pPr>
+      <w:r>
+        <w:t>Le client Angular 22 (thème blanc et bleu ciel) propose cinq onglets : Comptes (liste, création, blocage/activation), Opérations (paiement, dépôt, virement), Historique (filtrable par compte), Audit (événements Kafka) et Assistant. En développement, un proxy redirige /api/accounts et /api/transactions vers la passerelle, /api/audits vers audit-service et /api/chat vers le chatbot.</w:t>
       </w:r>
     </w:p>
     <w:p>
@@ -6574,11 +6213,12 @@
         <w:rPr>
           <w:noProof/>
         </w:rPr>
+        <w:lastRenderedPageBreak/>
         <w:drawing>
-          <wp:inline distT="0" distB="0" distL="0" distR="0" wp14:anchorId="2F28722C" wp14:editId="3DB0CDBD">
+          <wp:inline distT="0" distB="0" distL="0" distR="0" wp14:anchorId="48EC34AE" wp14:editId="28ADD09A">
             <wp:extent cx="5667375" cy="3581400"/>
             <wp:effectExtent l="0" t="0" r="0" b="0"/>
-            <wp:docPr id="5" name="Picture 5"/>
+            <wp:docPr id="4" name="Picture 4"/>
             <wp:cNvGraphicFramePr>
               <a:graphicFrameLocks xmlns:a="http://schemas.openxmlformats.org/drawingml/2006/main" noChangeAspect="1"/>
             </wp:cNvGraphicFramePr>
@@ -6627,7 +6267,7 @@
           <w:sz w:val="18"/>
           <w:szCs w:val="18"/>
         </w:rPr>
-        <w:t>Figure 5.2 — Formulaire d'opération</w:t>
+        <w:t>Figure 5.1 — Tableau de bord des comptes</w:t>
       </w:r>
     </w:p>
     <w:p>
@@ -6639,12 +6279,11 @@
         <w:rPr>
           <w:noProof/>
         </w:rPr>
-        <w:lastRenderedPageBreak/>
         <w:drawing>
-          <wp:inline distT="0" distB="0" distL="0" distR="0" wp14:anchorId="42D197A3" wp14:editId="7DB32918">
+          <wp:inline distT="0" distB="0" distL="0" distR="0" wp14:anchorId="2F28722C" wp14:editId="3DB0CDBD">
             <wp:extent cx="5667375" cy="3581400"/>
             <wp:effectExtent l="0" t="0" r="0" b="0"/>
-            <wp:docPr id="6" name="Picture 6"/>
+            <wp:docPr id="5" name="Picture 5"/>
             <wp:cNvGraphicFramePr>
               <a:graphicFrameLocks xmlns:a="http://schemas.openxmlformats.org/drawingml/2006/main" noChangeAspect="1"/>
             </wp:cNvGraphicFramePr>
@@ -6693,6 +6332,72 @@
           <w:sz w:val="18"/>
           <w:szCs w:val="18"/>
         </w:rPr>
+        <w:t>Figure 5.2 — Formulaire d'opération</w:t>
+      </w:r>
+    </w:p>
+    <w:p>
+      <w:pPr>
+        <w:spacing w:before="120" w:after="40"/>
+        <w:jc w:val="center"/>
+      </w:pPr>
+      <w:r>
+        <w:rPr>
+          <w:noProof/>
+        </w:rPr>
+        <w:lastRenderedPageBreak/>
+        <w:drawing>
+          <wp:inline distT="0" distB="0" distL="0" distR="0" wp14:anchorId="42D197A3" wp14:editId="7DB32918">
+            <wp:extent cx="5667375" cy="3581400"/>
+            <wp:effectExtent l="0" t="0" r="0" b="0"/>
+            <wp:docPr id="6" name="Picture 6"/>
+            <wp:cNvGraphicFramePr>
+              <a:graphicFrameLocks xmlns:a="http://schemas.openxmlformats.org/drawingml/2006/main" noChangeAspect="1"/>
+            </wp:cNvGraphicFramePr>
+            <a:graphic xmlns:a="http://schemas.openxmlformats.org/drawingml/2006/main">
+              <a:graphicData uri="http://schemas.openxmlformats.org/drawingml/2006/picture">
+                <pic:pic xmlns:pic="http://schemas.openxmlformats.org/drawingml/2006/picture">
+                  <pic:nvPicPr>
+                    <pic:cNvPr id="0" name=""/>
+                    <pic:cNvPicPr>
+                      <a:picLocks noChangeAspect="1" noChangeArrowheads="1"/>
+                    </pic:cNvPicPr>
+                  </pic:nvPicPr>
+                  <pic:blipFill>
+                    <a:blip r:embed="rId14"/>
+                    <a:srcRect/>
+                    <a:stretch>
+                      <a:fillRect/>
+                    </a:stretch>
+                  </pic:blipFill>
+                  <pic:spPr bwMode="auto">
+                    <a:xfrm>
+                      <a:off x="0" y="0"/>
+                      <a:ext cx="5667375" cy="3581400"/>
+                    </a:xfrm>
+                    <a:prstGeom prst="rect">
+                      <a:avLst/>
+                    </a:prstGeom>
+                  </pic:spPr>
+                </pic:pic>
+              </a:graphicData>
+            </a:graphic>
+          </wp:inline>
+        </w:drawing>
+      </w:r>
+    </w:p>
+    <w:p>
+      <w:pPr>
+        <w:spacing w:before="60" w:after="200"/>
+        <w:jc w:val="center"/>
+      </w:pPr>
+      <w:r>
+        <w:rPr>
+          <w:i/>
+          <w:iCs/>
+          <w:color w:val="7F8C8D"/>
+          <w:sz w:val="18"/>
+          <w:szCs w:val="18"/>
+        </w:rPr>
         <w:t>Figure 5.3 — Historique des transactions</w:t>
       </w:r>
     </w:p>
@@ -6760,12 +6465,6 @@
         <w:gridCol w:w="3006"/>
       </w:tblGrid>
       <w:tr>
-        <w:tblPrEx>
-          <w:tblCellMar>
-            <w:top w:w="0" w:type="dxa"/>
-            <w:bottom w:w="0" w:type="dxa"/>
-          </w:tblCellMar>
-        </w:tblPrEx>
         <w:trPr>
           <w:tblHeader/>
         </w:trPr>
@@ -6873,12 +6572,6 @@
         </w:tc>
       </w:tr>
       <w:tr>
-        <w:tblPrEx>
-          <w:tblCellMar>
-            <w:top w:w="0" w:type="dxa"/>
-            <w:bottom w:w="0" w:type="dxa"/>
-          </w:tblCellMar>
-        </w:tblPrEx>
         <w:tc>
           <w:tcPr>
             <w:tcW w:w="4400" w:type="dxa"/>
@@ -6965,12 +6658,6 @@
         </w:tc>
       </w:tr>
       <w:tr>
-        <w:tblPrEx>
-          <w:tblCellMar>
-            <w:top w:w="0" w:type="dxa"/>
-            <w:bottom w:w="0" w:type="dxa"/>
-          </w:tblCellMar>
-        </w:tblPrEx>
         <w:tc>
           <w:tcPr>
             <w:tcW w:w="4400" w:type="dxa"/>
@@ -7057,12 +6744,6 @@
         </w:tc>
       </w:tr>
       <w:tr>
-        <w:tblPrEx>
-          <w:tblCellMar>
-            <w:top w:w="0" w:type="dxa"/>
-            <w:bottom w:w="0" w:type="dxa"/>
-          </w:tblCellMar>
-        </w:tblPrEx>
         <w:tc>
           <w:tcPr>
             <w:tcW w:w="4400" w:type="dxa"/>
@@ -7149,12 +6830,6 @@
         </w:tc>
       </w:tr>
       <w:tr>
-        <w:tblPrEx>
-          <w:tblCellMar>
-            <w:top w:w="0" w:type="dxa"/>
-            <w:bottom w:w="0" w:type="dxa"/>
-          </w:tblCellMar>
-        </w:tblPrEx>
         <w:tc>
           <w:tcPr>
             <w:tcW w:w="4400" w:type="dxa"/>
@@ -7241,12 +6916,6 @@
         </w:tc>
       </w:tr>
       <w:tr>
-        <w:tblPrEx>
-          <w:tblCellMar>
-            <w:top w:w="0" w:type="dxa"/>
-            <w:bottom w:w="0" w:type="dxa"/>
-          </w:tblCellMar>
-        </w:tblPrEx>
         <w:tc>
           <w:tcPr>
             <w:tcW w:w="4400" w:type="dxa"/>
@@ -7333,12 +7002,6 @@
         </w:tc>
       </w:tr>
       <w:tr>
-        <w:tblPrEx>
-          <w:tblCellMar>
-            <w:top w:w="0" w:type="dxa"/>
-            <w:bottom w:w="0" w:type="dxa"/>
-          </w:tblCellMar>
-        </w:tblPrEx>
         <w:tc>
           <w:tcPr>
             <w:tcW w:w="4400" w:type="dxa"/>
@@ -7425,12 +7088,6 @@
         </w:tc>
       </w:tr>
       <w:tr>
-        <w:tblPrEx>
-          <w:tblCellMar>
-            <w:top w:w="0" w:type="dxa"/>
-            <w:bottom w:w="0" w:type="dxa"/>
-          </w:tblCellMar>
-        </w:tblPrEx>
         <w:tc>
           <w:tcPr>
             <w:tcW w:w="4400" w:type="dxa"/>
@@ -7842,12 +7499,6 @@
         <w:gridCol w:w="6806"/>
       </w:tblGrid>
       <w:tr>
-        <w:tblPrEx>
-          <w:tblCellMar>
-            <w:top w:w="0" w:type="dxa"/>
-            <w:bottom w:w="0" w:type="dxa"/>
-          </w:tblCellMar>
-        </w:tblPrEx>
         <w:trPr>
           <w:tblHeader/>
         </w:trPr>
@@ -7921,12 +7572,6 @@
         </w:tc>
       </w:tr>
       <w:tr>
-        <w:tblPrEx>
-          <w:tblCellMar>
-            <w:top w:w="0" w:type="dxa"/>
-            <w:bottom w:w="0" w:type="dxa"/>
-          </w:tblCellMar>
-        </w:tblPrEx>
         <w:tc>
           <w:tcPr>
             <w:tcW w:w="2400" w:type="dxa"/>
@@ -7985,12 +7630,6 @@
         </w:tc>
       </w:tr>
       <w:tr>
-        <w:tblPrEx>
-          <w:tblCellMar>
-            <w:top w:w="0" w:type="dxa"/>
-            <w:bottom w:w="0" w:type="dxa"/>
-          </w:tblCellMar>
-        </w:tblPrEx>
         <w:tc>
           <w:tcPr>
             <w:tcW w:w="2400" w:type="dxa"/>
@@ -8049,12 +7688,6 @@
         </w:tc>
       </w:tr>
       <w:tr>
-        <w:tblPrEx>
-          <w:tblCellMar>
-            <w:top w:w="0" w:type="dxa"/>
-            <w:bottom w:w="0" w:type="dxa"/>
-          </w:tblCellMar>
-        </w:tblPrEx>
         <w:tc>
           <w:tcPr>
             <w:tcW w:w="2400" w:type="dxa"/>
@@ -8208,8 +7841,8 @@
       </w:r>
     </w:p>
     <w:sectPr>
-      <w:headerReference w:type="default" r:id="rId14"/>
-      <w:footerReference w:type="default" r:id="rId15"/>
+      <w:headerReference w:type="default" r:id="rId15"/>
+      <w:footerReference w:type="default" r:id="rId16"/>
       <w:pgSz w:w="11906" w:h="16838"/>
       <w:pgMar w:top="1440" w:right="1260" w:bottom="1440" w:left="1440" w:header="708" w:footer="708" w:gutter="0"/>
       <w:cols w:space="720"/>

</xml_diff>